<commit_message>
Swap the true/false section for short answer
True/false let a student guess and move on. Five short questions, all
answerable from the reading above them, ask the student to actually go
back and find the answer.

Answers are accepted in Spanish or English — this part measures whether
the history landed, not English production, and the reading it draws on
is already in English.

The old "correct two false sentences" follow-up had nothing left to
operate on, so its four points fold into this section: five questions at
two points each, and the sheet still totals 48 plus a 2-point bonus.

Costs a few minutes, so the teacher notes now say 35-40 and point at the
timeline as the part to cut to get back near 30.

Co-Authored-By: Claude Opus 5 <noreply@anthropic.com>
Claude-Session: https://claude.ai/code/session_01VhieWbdCYdyt8ryFd6rQFC
</commit_message>
<xml_diff>
--- a/assignments/articulos-de-la-confederacion-ELL-answer-key.docx
+++ b/assignments/articulos-de-la-confederacion-ELL-answer-key.docx
@@ -115,7 +115,7 @@
           <w:sz w:val="20"/>
           <w:szCs w:val="20"/>
         </w:rPr>
-        <w:t xml:space="preserve">30–35 minutos. Las partes 1, 3, 4, 5 y 7 son de bajo esfuerzo de escritura a propósito, para que un estudiante poco motivado igual termine la hoja. Solo las partes 6 y 8 piden producción propia, y las dos traen marcos de oración.</w:t>
+        <w:t xml:space="preserve">35–40 minutos. Las partes 1, 4, 5 y 7 son de bajo esfuerzo de escritura a propósito, para que un estudiante poco motivado igual termine la hoja. Las partes 3, 6 y 8 piden producción propia; la 3 se contesta copiando de la lectura y la 8 trae marcos de oración. Para volver a unos 30 minutos, quita la parte 7.</w:t>
       </w:r>
     </w:p>
     <w:p>
@@ -149,7 +149,7 @@
           <w:sz w:val="20"/>
           <w:szCs w:val="20"/>
         </w:rPr>
-        <w:t xml:space="preserve">las instrucciones van en español y el contenido en inglés simplificado (oraciones cortas, vocabulario cognado, glosas en naranja). El estudiante aprende el contenido en su idioma fuerte con los enlaces que trae la hoja del estudiante y practica inglés en los ítems de bajo riesgo. Las partes 3B y 6 se contestan en español a propósito: miden historia, no inglés.</w:t>
+        <w:t xml:space="preserve">las instrucciones van en español y el contenido en inglés simplificado (oraciones cortas, vocabulario cognado, glosas en naranja). El estudiante aprende el contenido en su idioma fuerte con los enlaces que trae la hoja del estudiante y practica inglés en los ítems de bajo riesgo. Las partes 3 y 6 se pueden contestar en español a propósito: miden historia, no inglés.</w:t>
       </w:r>
     </w:p>
     <w:p>
@@ -217,7 +217,7 @@
           <w:sz w:val="20"/>
           <w:szCs w:val="20"/>
         </w:rPr>
-        <w:t xml:space="preserve">quitar la parte 7 (línea de tiempo) y la parte 8B. Para subir el nivel: pedir la parte 6 en inglés, o pedir 3 oraciones en vez de marcos en la parte 8.</w:t>
+        <w:t xml:space="preserve">quitar la parte 7 (línea de tiempo) y la parte 8B.   Para subir el nivel: exigir que la parte 3 se conteste solo en inglés, pedir la parte 6 en inglés, o pedir 3 oraciones en vez de marcos en la parte 8.</w:t>
       </w:r>
     </w:p>
     <w:p>
@@ -1224,7 +1224,7 @@
           <w:sz w:val="22"/>
           <w:szCs w:val="22"/>
         </w:rPr>
-        <w:t xml:space="preserve">PARTE 3  ·  Cierto o Falso</w:t>
+        <w:t xml:space="preserve">PARTE 3  ·  Respuestas cortas</w:t>
       </w:r>
       <w:r>
         <w:rPr>
@@ -1238,7 +1238,7 @@
           <w:sz w:val="19"/>
           <w:szCs w:val="19"/>
         </w:rPr>
-        <w:t xml:space="preserve">   Circle C (cierto / true) or F (falso / false).</w:t>
+        <w:t xml:space="preserve">   Answer in a few words. Spanish or English.</w:t>
       </w:r>
       <w:r>
         <w:rPr>
@@ -1258,13 +1258,13 @@
           <w:sz w:val="20"/>
           <w:szCs w:val="20"/>
         </w:rPr>
-        <w:t xml:space="preserve">	6 pts</w:t>
-      </w:r>
-    </w:p>
-    <w:p>
-      <w:pPr>
-        <w:keepNext w:val="false"/>
-        <w:spacing w:after="80" w:before="0" w:line="260"/>
+        <w:t xml:space="preserve">	10 pts</w:t>
+      </w:r>
+    </w:p>
+    <w:p>
+      <w:pPr>
+        <w:keepNext w:val="false"/>
+        <w:spacing w:after="100" w:before="0" w:line="260"/>
       </w:pPr>
       <w:r>
         <w:rPr>
@@ -1278,13 +1278,13 @@
           <w:sz w:val="19"/>
           <w:szCs w:val="19"/>
         </w:rPr>
-        <w:t xml:space="preserve">Encierra en un círculo la respuesta correcta.</w:t>
-      </w:r>
-    </w:p>
-    <w:p>
-      <w:pPr>
-        <w:keepNext w:val="false"/>
-        <w:spacing w:after="50" w:before="0" w:line="260"/>
+        <w:t xml:space="preserve">Contesta con POCAS palabras. Puedes contestar EN ESPAÑOL o en inglés. Todas las respuestas están en la lectura de arriba.</w:t>
+      </w:r>
+    </w:p>
+    <w:p>
+      <w:pPr>
+        <w:keepNext w:val="false"/>
+        <w:spacing w:after="10" w:before="0" w:line="260"/>
       </w:pPr>
       <w:r>
         <w:rPr>
@@ -1298,320 +1298,14 @@
           <w:sz w:val="21"/>
           <w:szCs w:val="21"/>
         </w:rPr>
-        <w:t xml:space="preserve">1. </w:t>
-      </w:r>
-      <w:r>
-        <w:rPr>
-          <w:rFonts w:ascii="Arial" w:cs="Arial" w:eastAsia="Arial" w:hAnsi="Arial"/>
-          <w:b/>
-          <w:bCs/>
-          <w:i w:val="false"/>
-          <w:iCs w:val="false"/>
-          <w:caps w:val="false"/>
-          <w:color w:val="B00020"/>
-          <w:sz w:val="21"/>
-          <w:szCs w:val="21"/>
-        </w:rPr>
-        <w:t xml:space="preserve">FALSO</w:t>
-      </w:r>
-      <w:r>
-        <w:rPr>
-          <w:rFonts w:ascii="Arial" w:cs="Arial" w:eastAsia="Arial" w:hAnsi="Arial"/>
-          <w:b w:val="false"/>
-          <w:bCs w:val="false"/>
-          <w:i w:val="false"/>
-          <w:iCs w:val="false"/>
-          <w:caps w:val="false"/>
-          <w:color w:val="000000"/>
-          <w:sz w:val="21"/>
-          <w:szCs w:val="21"/>
-        </w:rPr>
-        <w:t xml:space="preserve">   The Articles of Confederation made a STRONG central government.</w:t>
-      </w:r>
-    </w:p>
-    <w:p>
-      <w:pPr>
-        <w:keepNext w:val="false"/>
-        <w:spacing w:after="50" w:before="0" w:line="260"/>
-      </w:pPr>
-      <w:r>
-        <w:rPr>
-          <w:rFonts w:ascii="Arial" w:cs="Arial" w:eastAsia="Arial" w:hAnsi="Arial"/>
-          <w:b w:val="false"/>
-          <w:bCs w:val="false"/>
-          <w:i w:val="false"/>
-          <w:iCs w:val="false"/>
-          <w:caps w:val="false"/>
-          <w:color w:val="000000"/>
-          <w:sz w:val="21"/>
-          <w:szCs w:val="21"/>
-        </w:rPr>
-        <w:t xml:space="preserve">2. </w:t>
-      </w:r>
-      <w:r>
-        <w:rPr>
-          <w:rFonts w:ascii="Arial" w:cs="Arial" w:eastAsia="Arial" w:hAnsi="Arial"/>
-          <w:b/>
-          <w:bCs/>
-          <w:i w:val="false"/>
-          <w:iCs w:val="false"/>
-          <w:caps w:val="false"/>
-          <w:color w:val="1B7F3B"/>
-          <w:sz w:val="21"/>
-          <w:szCs w:val="21"/>
-        </w:rPr>
-        <w:t xml:space="preserve">CIERTO</w:t>
-      </w:r>
-      <w:r>
-        <w:rPr>
-          <w:rFonts w:ascii="Arial" w:cs="Arial" w:eastAsia="Arial" w:hAnsi="Arial"/>
-          <w:b w:val="false"/>
-          <w:bCs w:val="false"/>
-          <w:i w:val="false"/>
-          <w:iCs w:val="false"/>
-          <w:caps w:val="false"/>
-          <w:color w:val="000000"/>
-          <w:sz w:val="21"/>
-          <w:szCs w:val="21"/>
-        </w:rPr>
-        <w:t xml:space="preserve">   Each state had one vote in Congress.</w:t>
-      </w:r>
-    </w:p>
-    <w:p>
-      <w:pPr>
-        <w:keepNext w:val="false"/>
-        <w:spacing w:after="50" w:before="0" w:line="260"/>
-      </w:pPr>
-      <w:r>
-        <w:rPr>
-          <w:rFonts w:ascii="Arial" w:cs="Arial" w:eastAsia="Arial" w:hAnsi="Arial"/>
-          <w:b w:val="false"/>
-          <w:bCs w:val="false"/>
-          <w:i w:val="false"/>
-          <w:iCs w:val="false"/>
-          <w:caps w:val="false"/>
-          <w:color w:val="000000"/>
-          <w:sz w:val="21"/>
-          <w:szCs w:val="21"/>
-        </w:rPr>
-        <w:t xml:space="preserve">3. </w:t>
-      </w:r>
-      <w:r>
-        <w:rPr>
-          <w:rFonts w:ascii="Arial" w:cs="Arial" w:eastAsia="Arial" w:hAnsi="Arial"/>
-          <w:b/>
-          <w:bCs/>
-          <w:i w:val="false"/>
-          <w:iCs w:val="false"/>
-          <w:caps w:val="false"/>
-          <w:color w:val="B00020"/>
-          <w:sz w:val="21"/>
-          <w:szCs w:val="21"/>
-        </w:rPr>
-        <w:t xml:space="preserve">FALSO</w:t>
-      </w:r>
-      <w:r>
-        <w:rPr>
-          <w:rFonts w:ascii="Arial" w:cs="Arial" w:eastAsia="Arial" w:hAnsi="Arial"/>
-          <w:b w:val="false"/>
-          <w:bCs w:val="false"/>
-          <w:i w:val="false"/>
-          <w:iCs w:val="false"/>
-          <w:caps w:val="false"/>
-          <w:color w:val="000000"/>
-          <w:sz w:val="21"/>
-          <w:szCs w:val="21"/>
-        </w:rPr>
-        <w:t xml:space="preserve">   Congress could collect taxes from the people.</w:t>
-      </w:r>
-    </w:p>
-    <w:p>
-      <w:pPr>
-        <w:keepNext w:val="false"/>
-        <w:spacing w:after="50" w:before="0" w:line="260"/>
-      </w:pPr>
-      <w:r>
-        <w:rPr>
-          <w:rFonts w:ascii="Arial" w:cs="Arial" w:eastAsia="Arial" w:hAnsi="Arial"/>
-          <w:b w:val="false"/>
-          <w:bCs w:val="false"/>
-          <w:i w:val="false"/>
-          <w:iCs w:val="false"/>
-          <w:caps w:val="false"/>
-          <w:color w:val="000000"/>
-          <w:sz w:val="21"/>
-          <w:szCs w:val="21"/>
-        </w:rPr>
-        <w:t xml:space="preserve">4. </w:t>
-      </w:r>
-      <w:r>
-        <w:rPr>
-          <w:rFonts w:ascii="Arial" w:cs="Arial" w:eastAsia="Arial" w:hAnsi="Arial"/>
-          <w:b/>
-          <w:bCs/>
-          <w:i w:val="false"/>
-          <w:iCs w:val="false"/>
-          <w:caps w:val="false"/>
-          <w:color w:val="1B7F3B"/>
-          <w:sz w:val="21"/>
-          <w:szCs w:val="21"/>
-        </w:rPr>
-        <w:t xml:space="preserve">CIERTO</w:t>
-      </w:r>
-      <w:r>
-        <w:rPr>
-          <w:rFonts w:ascii="Arial" w:cs="Arial" w:eastAsia="Arial" w:hAnsi="Arial"/>
-          <w:b w:val="false"/>
-          <w:bCs w:val="false"/>
-          <w:i w:val="false"/>
-          <w:iCs w:val="false"/>
-          <w:caps w:val="false"/>
-          <w:color w:val="000000"/>
-          <w:sz w:val="21"/>
-          <w:szCs w:val="21"/>
-        </w:rPr>
-        <w:t xml:space="preserve">   There was no president under the Articles.</w:t>
-      </w:r>
-    </w:p>
-    <w:p>
-      <w:pPr>
-        <w:keepNext w:val="false"/>
-        <w:spacing w:after="50" w:before="0" w:line="260"/>
-      </w:pPr>
-      <w:r>
-        <w:rPr>
-          <w:rFonts w:ascii="Arial" w:cs="Arial" w:eastAsia="Arial" w:hAnsi="Arial"/>
-          <w:b w:val="false"/>
-          <w:bCs w:val="false"/>
-          <w:i w:val="false"/>
-          <w:iCs w:val="false"/>
-          <w:caps w:val="false"/>
-          <w:color w:val="000000"/>
-          <w:sz w:val="21"/>
-          <w:szCs w:val="21"/>
-        </w:rPr>
-        <w:t xml:space="preserve">5. </w:t>
-      </w:r>
-      <w:r>
-        <w:rPr>
-          <w:rFonts w:ascii="Arial" w:cs="Arial" w:eastAsia="Arial" w:hAnsi="Arial"/>
-          <w:b/>
-          <w:bCs/>
-          <w:i w:val="false"/>
-          <w:iCs w:val="false"/>
-          <w:caps w:val="false"/>
-          <w:color w:val="1B7F3B"/>
-          <w:sz w:val="21"/>
-          <w:szCs w:val="21"/>
-        </w:rPr>
-        <w:t xml:space="preserve">CIERTO</w:t>
-      </w:r>
-      <w:r>
-        <w:rPr>
-          <w:rFonts w:ascii="Arial" w:cs="Arial" w:eastAsia="Arial" w:hAnsi="Arial"/>
-          <w:b w:val="false"/>
-          <w:bCs w:val="false"/>
-          <w:i w:val="false"/>
-          <w:iCs w:val="false"/>
-          <w:caps w:val="false"/>
-          <w:color w:val="000000"/>
-          <w:sz w:val="21"/>
-          <w:szCs w:val="21"/>
-        </w:rPr>
-        <w:t xml:space="preserve">   All 13 states had to agree to change the Articles.</w:t>
-      </w:r>
-    </w:p>
-    <w:p>
-      <w:pPr>
-        <w:keepNext w:val="false"/>
-        <w:spacing w:after="50" w:before="0" w:line="260"/>
-      </w:pPr>
-      <w:r>
-        <w:rPr>
-          <w:rFonts w:ascii="Arial" w:cs="Arial" w:eastAsia="Arial" w:hAnsi="Arial"/>
-          <w:b w:val="false"/>
-          <w:bCs w:val="false"/>
-          <w:i w:val="false"/>
-          <w:iCs w:val="false"/>
-          <w:caps w:val="false"/>
-          <w:color w:val="000000"/>
-          <w:sz w:val="21"/>
-          <w:szCs w:val="21"/>
-        </w:rPr>
-        <w:t xml:space="preserve">6. </w:t>
-      </w:r>
-      <w:r>
-        <w:rPr>
-          <w:rFonts w:ascii="Arial" w:cs="Arial" w:eastAsia="Arial" w:hAnsi="Arial"/>
-          <w:b/>
-          <w:bCs/>
-          <w:i w:val="false"/>
-          <w:iCs w:val="false"/>
-          <w:caps w:val="false"/>
-          <w:color w:val="B00020"/>
-          <w:sz w:val="21"/>
-          <w:szCs w:val="21"/>
-        </w:rPr>
-        <w:t xml:space="preserve">FALSO</w:t>
-      </w:r>
-      <w:r>
-        <w:rPr>
-          <w:rFonts w:ascii="Arial" w:cs="Arial" w:eastAsia="Arial" w:hAnsi="Arial"/>
-          <w:b w:val="false"/>
-          <w:bCs w:val="false"/>
-          <w:i w:val="false"/>
-          <w:iCs w:val="false"/>
-          <w:caps w:val="false"/>
-          <w:color w:val="000000"/>
-          <w:sz w:val="21"/>
-          <w:szCs w:val="21"/>
-        </w:rPr>
-        <w:t xml:space="preserve">   Shays’ Rebellion happened in Texas.</w:t>
-      </w:r>
-    </w:p>
-    <w:p>
-      <w:pPr>
-        <w:keepNext w:val="false"/>
-        <w:spacing w:after="40" w:before="0" w:line="260"/>
-      </w:pPr>
-      <w:r>
-        <w:rPr>
-          <w:rFonts w:ascii="Arial" w:cs="Arial" w:eastAsia="Arial" w:hAnsi="Arial"/>
-          <w:b w:val="false"/>
-          <w:bCs w:val="false"/>
-          <w:i w:val="false"/>
-          <w:iCs w:val="false"/>
-          <w:caps w:val="false"/>
-          <w:color w:val="000000"/>
-          <w:sz w:val="21"/>
-          <w:szCs w:val="21"/>
-        </w:rPr>
-        <w:t xml:space="preserve"/>
-      </w:r>
-    </w:p>
-    <w:p>
-      <w:pPr>
-        <w:keepNext/>
-        <w:shd w:fill="DCE6F1" w:color="auto" w:val="clear"/>
-        <w:tabs>
-          <w:tab w:val="right" w:pos="10680"/>
-        </w:tabs>
-        <w:spacing w:after="90" w:before="220" w:line="260"/>
-      </w:pPr>
-      <w:r>
-        <w:rPr>
-          <w:rFonts w:ascii="Arial" w:cs="Arial" w:eastAsia="Arial" w:hAnsi="Arial"/>
-          <w:b/>
-          <w:bCs/>
-          <w:i w:val="false"/>
-          <w:iCs w:val="false"/>
-          <w:caps w:val="false"/>
-          <w:color w:val="000000"/>
-          <w:sz w:val="22"/>
-          <w:szCs w:val="22"/>
-        </w:rPr>
-        <w:t xml:space="preserve">PARTE 3B  ·  Corrige</w:t>
-      </w:r>
+        <w:t xml:space="preserve">1. Who could NOT collect taxes?</w:t>
+      </w:r>
+    </w:p>
+    <w:p>
+      <w:pPr>
+        <w:keepNext w:val="false"/>
+        <w:spacing w:after="20" w:before="0" w:line="260"/>
+      </w:pPr>
       <w:r>
         <w:rPr>
           <w:rFonts w:ascii="Arial" w:cs="Arial" w:eastAsia="Arial" w:hAnsi="Arial"/>
@@ -1624,79 +1318,19 @@
           <w:sz w:val="19"/>
           <w:szCs w:val="19"/>
         </w:rPr>
-        <w:t xml:space="preserve">   Pick TWO false sentences. Fix them in Spanish.</w:t>
-      </w:r>
-      <w:r>
-        <w:rPr>
-          <w:rFonts w:ascii="Arial" w:cs="Arial" w:eastAsia="Arial" w:hAnsi="Arial"/>
-        </w:rPr>
-        <w:t xml:space="preserve"/>
-      </w:r>
+        <w:t xml:space="preserve">¿Quién no podía cobrar impuestos?</w:t>
+      </w:r>
+    </w:p>
+    <w:p>
+      <w:pPr>
+        <w:keepNext w:val="false"/>
+        <w:spacing w:after="40" w:before="0" w:line="260"/>
+      </w:pPr>
       <w:r>
         <w:rPr>
           <w:rFonts w:ascii="Arial" w:cs="Arial" w:eastAsia="Arial" w:hAnsi="Arial"/>
           <w:b/>
           <w:bCs/>
-          <w:i w:val="false"/>
-          <w:iCs w:val="false"/>
-          <w:caps w:val="false"/>
-          <w:color w:val="1F3864"/>
-          <w:sz w:val="20"/>
-          <w:szCs w:val="20"/>
-        </w:rPr>
-        <w:t xml:space="preserve">	4 pts</w:t>
-      </w:r>
-    </w:p>
-    <w:p>
-      <w:pPr>
-        <w:keepNext w:val="false"/>
-        <w:spacing w:after="60" w:before="0" w:line="260"/>
-      </w:pPr>
-      <w:r>
-        <w:rPr>
-          <w:rFonts w:ascii="Arial" w:cs="Arial" w:eastAsia="Arial" w:hAnsi="Arial"/>
-          <w:b w:val="false"/>
-          <w:bCs w:val="false"/>
-          <w:i/>
-          <w:iCs/>
-          <w:caps w:val="false"/>
-          <w:color w:val="000000"/>
-          <w:sz w:val="19"/>
-          <w:szCs w:val="19"/>
-        </w:rPr>
-        <w:t xml:space="preserve">Escoge DOS oraciones falsas. Escríbelas correctamente EN ESPAÑOL.</w:t>
-      </w:r>
-    </w:p>
-    <w:p>
-      <w:pPr>
-        <w:keepNext w:val="false"/>
-        <w:spacing w:after="60" w:before="0" w:line="260"/>
-      </w:pPr>
-      <w:r>
-        <w:rPr>
-          <w:rFonts w:ascii="Arial" w:cs="Arial" w:eastAsia="Arial" w:hAnsi="Arial"/>
-          <w:b w:val="false"/>
-          <w:bCs w:val="false"/>
-          <w:i/>
-          <w:iCs/>
-          <w:caps w:val="false"/>
-          <w:color w:val="000000"/>
-          <w:sz w:val="19"/>
-          <w:szCs w:val="19"/>
-        </w:rPr>
-        <w:t xml:space="preserve">Se aceptan dos cualesquiera de estas tres (u otra corrección equivalente):</w:t>
-      </w:r>
-    </w:p>
-    <w:p>
-      <w:pPr>
-        <w:keepNext w:val="false"/>
-        <w:spacing w:after="60" w:before="0" w:line="260"/>
-      </w:pPr>
-      <w:r>
-        <w:rPr>
-          <w:rFonts w:ascii="Arial" w:cs="Arial" w:eastAsia="Arial" w:hAnsi="Arial"/>
-          <w:b w:val="false"/>
-          <w:bCs w:val="false"/>
           <w:i w:val="false"/>
           <w:iCs w:val="false"/>
           <w:caps w:val="false"/>
@@ -1704,19 +1338,59 @@
           <w:sz w:val="20"/>
           <w:szCs w:val="20"/>
         </w:rPr>
-        <w:t xml:space="preserve">#1 → Los Artículos crearon un gobierno central MUY DÉBIL, no fuerte.</w:t>
-      </w:r>
-    </w:p>
-    <w:p>
-      <w:pPr>
-        <w:keepNext w:val="false"/>
-        <w:spacing w:after="60" w:before="0" w:line="260"/>
-      </w:pPr>
-      <w:r>
-        <w:rPr>
-          <w:rFonts w:ascii="Arial" w:cs="Arial" w:eastAsia="Arial" w:hAnsi="Arial"/>
-          <w:b w:val="false"/>
-          <w:bCs w:val="false"/>
+        <w:t xml:space="preserve">Congress.  /  El Congreso.</w:t>
+      </w:r>
+    </w:p>
+    <w:p>
+      <w:pPr>
+        <w:keepNext w:val="false"/>
+        <w:spacing w:after="10" w:before="90" w:line="260"/>
+      </w:pPr>
+      <w:r>
+        <w:rPr>
+          <w:rFonts w:ascii="Arial" w:cs="Arial" w:eastAsia="Arial" w:hAnsi="Arial"/>
+          <w:b w:val="false"/>
+          <w:bCs w:val="false"/>
+          <w:i w:val="false"/>
+          <w:iCs w:val="false"/>
+          <w:caps w:val="false"/>
+          <w:color w:val="000000"/>
+          <w:sz w:val="21"/>
+          <w:szCs w:val="21"/>
+        </w:rPr>
+        <w:t xml:space="preserve">2. How many votes did each state have in Congress?</w:t>
+      </w:r>
+    </w:p>
+    <w:p>
+      <w:pPr>
+        <w:keepNext w:val="false"/>
+        <w:spacing w:after="20" w:before="0" w:line="260"/>
+      </w:pPr>
+      <w:r>
+        <w:rPr>
+          <w:rFonts w:ascii="Arial" w:cs="Arial" w:eastAsia="Arial" w:hAnsi="Arial"/>
+          <w:b w:val="false"/>
+          <w:bCs w:val="false"/>
+          <w:i/>
+          <w:iCs/>
+          <w:caps w:val="false"/>
+          <w:color w:val="3B4A5A"/>
+          <w:sz w:val="19"/>
+          <w:szCs w:val="19"/>
+        </w:rPr>
+        <w:t xml:space="preserve">¿Cuántos votos tenía cada estado en el Congreso?</w:t>
+      </w:r>
+    </w:p>
+    <w:p>
+      <w:pPr>
+        <w:keepNext w:val="false"/>
+        <w:spacing w:after="40" w:before="0" w:line="260"/>
+      </w:pPr>
+      <w:r>
+        <w:rPr>
+          <w:rFonts w:ascii="Arial" w:cs="Arial" w:eastAsia="Arial" w:hAnsi="Arial"/>
+          <w:b/>
+          <w:bCs/>
           <w:i w:val="false"/>
           <w:iCs w:val="false"/>
           <w:caps w:val="false"/>
@@ -1724,19 +1398,59 @@
           <w:sz w:val="20"/>
           <w:szCs w:val="20"/>
         </w:rPr>
-        <w:t xml:space="preserve">#3 → El Congreso NO podía cobrar impuestos; tenía que pedirles dinero a los estados.</w:t>
-      </w:r>
-    </w:p>
-    <w:p>
-      <w:pPr>
-        <w:keepNext w:val="false"/>
-        <w:spacing w:after="60" w:before="0" w:line="260"/>
-      </w:pPr>
-      <w:r>
-        <w:rPr>
-          <w:rFonts w:ascii="Arial" w:cs="Arial" w:eastAsia="Arial" w:hAnsi="Arial"/>
-          <w:b w:val="false"/>
-          <w:bCs w:val="false"/>
+        <w:t xml:space="preserve">One vote.  /  Un voto.</w:t>
+      </w:r>
+    </w:p>
+    <w:p>
+      <w:pPr>
+        <w:keepNext w:val="false"/>
+        <w:spacing w:after="10" w:before="90" w:line="260"/>
+      </w:pPr>
+      <w:r>
+        <w:rPr>
+          <w:rFonts w:ascii="Arial" w:cs="Arial" w:eastAsia="Arial" w:hAnsi="Arial"/>
+          <w:b w:val="false"/>
+          <w:bCs w:val="false"/>
+          <w:i w:val="false"/>
+          <w:iCs w:val="false"/>
+          <w:caps w:val="false"/>
+          <w:color w:val="000000"/>
+          <w:sz w:val="21"/>
+          <w:szCs w:val="21"/>
+        </w:rPr>
+        <w:t xml:space="preserve">3. Why did the states make a weak government?</w:t>
+      </w:r>
+    </w:p>
+    <w:p>
+      <w:pPr>
+        <w:keepNext w:val="false"/>
+        <w:spacing w:after="20" w:before="0" w:line="260"/>
+      </w:pPr>
+      <w:r>
+        <w:rPr>
+          <w:rFonts w:ascii="Arial" w:cs="Arial" w:eastAsia="Arial" w:hAnsi="Arial"/>
+          <w:b w:val="false"/>
+          <w:bCs w:val="false"/>
+          <w:i/>
+          <w:iCs/>
+          <w:caps w:val="false"/>
+          <w:color w:val="3B4A5A"/>
+          <w:sz w:val="19"/>
+          <w:szCs w:val="19"/>
+        </w:rPr>
+        <w:t xml:space="preserve">¿Por qué los estados hicieron un gobierno débil?</w:t>
+      </w:r>
+    </w:p>
+    <w:p>
+      <w:pPr>
+        <w:keepNext w:val="false"/>
+        <w:spacing w:after="40" w:before="0" w:line="260"/>
+      </w:pPr>
+      <w:r>
+        <w:rPr>
+          <w:rFonts w:ascii="Arial" w:cs="Arial" w:eastAsia="Arial" w:hAnsi="Arial"/>
+          <w:b/>
+          <w:bCs/>
           <w:i w:val="false"/>
           <w:iCs w:val="false"/>
           <w:caps w:val="false"/>
@@ -1744,7 +1458,127 @@
           <w:sz w:val="20"/>
           <w:szCs w:val="20"/>
         </w:rPr>
-        <w:t xml:space="preserve">#6 → La Rebelión de Shays ocurrió en Massachusetts, no en Texas.</w:t>
+        <w:t xml:space="preserve">They were afraid of a strong king.  /  Tenían miedo de un rey fuerte.</w:t>
+      </w:r>
+    </w:p>
+    <w:p>
+      <w:pPr>
+        <w:keepNext w:val="false"/>
+        <w:spacing w:after="10" w:before="90" w:line="260"/>
+      </w:pPr>
+      <w:r>
+        <w:rPr>
+          <w:rFonts w:ascii="Arial" w:cs="Arial" w:eastAsia="Arial" w:hAnsi="Arial"/>
+          <w:b w:val="false"/>
+          <w:bCs w:val="false"/>
+          <w:i w:val="false"/>
+          <w:iCs w:val="false"/>
+          <w:caps w:val="false"/>
+          <w:color w:val="000000"/>
+          <w:sz w:val="21"/>
+          <w:szCs w:val="21"/>
+        </w:rPr>
+        <w:t xml:space="preserve">4. How many states had to say yes to change the Articles?</w:t>
+      </w:r>
+    </w:p>
+    <w:p>
+      <w:pPr>
+        <w:keepNext w:val="false"/>
+        <w:spacing w:after="20" w:before="0" w:line="260"/>
+      </w:pPr>
+      <w:r>
+        <w:rPr>
+          <w:rFonts w:ascii="Arial" w:cs="Arial" w:eastAsia="Arial" w:hAnsi="Arial"/>
+          <w:b w:val="false"/>
+          <w:bCs w:val="false"/>
+          <w:i/>
+          <w:iCs/>
+          <w:caps w:val="false"/>
+          <w:color w:val="3B4A5A"/>
+          <w:sz w:val="19"/>
+          <w:szCs w:val="19"/>
+        </w:rPr>
+        <w:t xml:space="preserve">¿Cuántos estados tenían que decir que sí para cambiar los Artículos?</w:t>
+      </w:r>
+    </w:p>
+    <w:p>
+      <w:pPr>
+        <w:keepNext w:val="false"/>
+        <w:spacing w:after="40" w:before="0" w:line="260"/>
+      </w:pPr>
+      <w:r>
+        <w:rPr>
+          <w:rFonts w:ascii="Arial" w:cs="Arial" w:eastAsia="Arial" w:hAnsi="Arial"/>
+          <w:b/>
+          <w:bCs/>
+          <w:i w:val="false"/>
+          <w:iCs w:val="false"/>
+          <w:caps w:val="false"/>
+          <w:color w:val="B00020"/>
+          <w:sz w:val="20"/>
+          <w:szCs w:val="20"/>
+        </w:rPr>
+        <w:t xml:space="preserve">All 13.  /  Los 13.</w:t>
+      </w:r>
+    </w:p>
+    <w:p>
+      <w:pPr>
+        <w:keepNext w:val="false"/>
+        <w:spacing w:after="10" w:before="90" w:line="260"/>
+      </w:pPr>
+      <w:r>
+        <w:rPr>
+          <w:rFonts w:ascii="Arial" w:cs="Arial" w:eastAsia="Arial" w:hAnsi="Arial"/>
+          <w:b w:val="false"/>
+          <w:bCs w:val="false"/>
+          <w:i w:val="false"/>
+          <w:iCs w:val="false"/>
+          <w:caps w:val="false"/>
+          <w:color w:val="000000"/>
+          <w:sz w:val="21"/>
+          <w:szCs w:val="21"/>
+        </w:rPr>
+        <w:t xml:space="preserve">5. What happened in Massachusetts in 1786?</w:t>
+      </w:r>
+    </w:p>
+    <w:p>
+      <w:pPr>
+        <w:keepNext w:val="false"/>
+        <w:spacing w:after="20" w:before="0" w:line="260"/>
+      </w:pPr>
+      <w:r>
+        <w:rPr>
+          <w:rFonts w:ascii="Arial" w:cs="Arial" w:eastAsia="Arial" w:hAnsi="Arial"/>
+          <w:b w:val="false"/>
+          <w:bCs w:val="false"/>
+          <w:i/>
+          <w:iCs/>
+          <w:caps w:val="false"/>
+          <w:color w:val="3B4A5A"/>
+          <w:sz w:val="19"/>
+          <w:szCs w:val="19"/>
+        </w:rPr>
+        <w:t xml:space="preserve">¿Qué pasó en Massachusetts en 1786?</w:t>
+      </w:r>
+    </w:p>
+    <w:p>
+      <w:pPr>
+        <w:keepNext w:val="false"/>
+        <w:spacing w:after="40" w:before="0" w:line="260"/>
+      </w:pPr>
+      <w:r>
+        <w:rPr>
+          <w:rFonts w:ascii="Arial" w:cs="Arial" w:eastAsia="Arial" w:hAnsi="Arial"/>
+          <w:b/>
+          <w:bCs/>
+          <w:i w:val="false"/>
+          <w:iCs w:val="false"/>
+          <w:caps w:val="false"/>
+          <w:color w:val="B00020"/>
+          <w:sz w:val="20"/>
+          <w:szCs w:val="20"/>
+        </w:rPr>
+        <w:t xml:space="preserve">Shays’ Rebellion — poor farmers rebelled.  /  La Rebelión de Shays: se levantaron agricultores pobres.</w:t>
       </w:r>
     </w:p>
     <w:p>

</xml_diff>